<commit_message>
Launch PMOffice site with branded navigation and complete training catalog
</commit_message>
<xml_diff>
--- a/docs/public/downloads/copilot-for-microsoft-project.docx
+++ b/docs/public/downloads/copilot-for-microsoft-project.docx
@@ -20,7 +20,7 @@
     </w:p>
     <w:p>
       <w:r>
-        <w:t>교육 과정 소개서  |  2026년 10월 12일  |  v1.0</w:t>
+        <w:t>교육 과정 소개서  |  2026년 10월 12일  |  v1.1</w:t>
       </w:r>
     </w:p>
     <w:p>
@@ -519,9 +519,7 @@
       </w:r>
     </w:p>
     <w:p>
-      <w:r>
-        <w:br w:type="page"/>
-      </w:r>
+      <w:r/>
     </w:p>
     <w:p>
       <w:pPr>
@@ -1313,9 +1311,7 @@
       </w:r>
     </w:p>
     <w:p>
-      <w:r>
-        <w:br w:type="page"/>
-      </w:r>
+      <w:r/>
     </w:p>
     <w:p>
       <w:pPr>
@@ -1840,9 +1836,7 @@
       </w:r>
     </w:p>
     <w:p>
-      <w:r>
-        <w:br w:type="page"/>
-      </w:r>
+      <w:r/>
     </w:p>
     <w:p>
       <w:pPr>

</xml_diff>